<commit_message>
Add regex support for OCR rules
</commit_message>
<xml_diff>
--- a/tests/test.docx
+++ b/tests/test.docx
@@ -28,23 +28,36 @@
     <w:p>
       <w:proofErr w:type="spellStart"/>
       <w:r>
-        <w:t>Sch</w:t>
+        <w:t>Sta</w:t>
       </w:r>
       <w:proofErr w:type="spellEnd"/>
       <w:r>
-        <w:t xml:space="preserve"> den</w:t>
-      </w:r>
-    </w:p>
-    <w:p/>
-    <w:p>
-      <w:r>
-        <w:t>f r</w:t>
-      </w:r>
+        <w:t xml:space="preserve">  e</w:t>
+      </w:r>
+      <w:bookmarkStart w:id="0" w:name="_GoBack"/>
+      <w:bookmarkEnd w:id="0"/>
     </w:p>
     <w:p/>
     <w:p>
       <w:proofErr w:type="spellStart"/>
       <w:r>
+        <w:t>Sch</w:t>
+      </w:r>
+      <w:proofErr w:type="spellEnd"/>
+      <w:r>
+        <w:t xml:space="preserve"> den</w:t>
+      </w:r>
+    </w:p>
+    <w:p/>
+    <w:p>
+      <w:r>
+        <w:t>f r</w:t>
+      </w:r>
+    </w:p>
+    <w:p/>
+    <w:p>
+      <w:proofErr w:type="spellStart"/>
+      <w:r>
         <w:t>ver</w:t>
       </w:r>
       <w:proofErr w:type="spellEnd"/>
@@ -55,8 +68,6 @@
       <w:r>
         <w:t>ffentlicht</w:t>
       </w:r>
-      <w:bookmarkStart w:id="0" w:name="_GoBack"/>
-      <w:bookmarkEnd w:id="0"/>
       <w:proofErr w:type="spellEnd"/>
     </w:p>
     <w:sectPr>

</xml_diff>